<commit_message>
Add Aeon (co-founded AI consulting venture) + Tenex AI Strategist resume cut
- Capture Aeon in profile.md: bespoke AI products for mid-market energy/manufacturing,
  discovery-to-build model, flagship upstream O&G drilling-reports engagement, stack.
- New resume variant tailored to Tenex AI Strategist, led by Aeon (strategist +
  forward-deployed-engineer model) and the agentic-AI/workflow-automation work.

Co-Authored-By: Claude Opus 4.8 <noreply@anthropic.com>
Claude-Session: https://claude.ai/code/session_013nG8GSUWBoqidsGzAeMyTf
</commit_message>
<xml_diff>
--- a/resumes/output/AdamBreaux_Tenex.docx
+++ b/resumes/output/AdamBreaux_Tenex.docx
@@ -45,7 +45,7 @@
           <w:i w:val="0"/>
           <w:sz w:val="21"/>
         </w:rPr>
-        <w:t>Operator and daily agentic-AI practitioner who turns stalled AI pilots into workflows teams actually run. Founder of an AI consulting practice that embeds with companies, maps how work really happens, finds the highest-ROI bets, and ships enterprise-grade automations into production. Three years as a chief of staff and venture operator building companies 0-to-1 and the AI systems that run them. Credible with CEOs and engineers in equal measure, with a strong bias to ship.</w:t>
+        <w:t>Operator and daily agentic-AI practitioner who turns stalled AI pilots into workflows teams actually run. Co-founder of Aeon, an AI consulting practice that embeds with mid-market energy and manufacturing companies, runs executive discovery to find the real bottleneck, and ships bespoke AI products into production. Before that, three years as a chief of staff and venture operator building companies 0-to-1 and the AI systems that run them. Credible with CEOs and field engineers alike, with a bias to ship.</w:t>
       </w:r>
     </w:p>
     <w:p>
@@ -80,7 +80,7 @@
           <w:i w:val="0"/>
           <w:sz w:val="22"/>
         </w:rPr>
-        <w:t>Founder</w:t>
+        <w:t>Co-Founder</w:t>
       </w:r>
       <w:r>
         <w:tab/>
@@ -108,7 +108,7 @@
           <w:color w:val="444444"/>
           <w:sz w:val="20"/>
         </w:rPr>
-        <w:t>WKB Studio  —  AI consulting &amp; automation  |  Tulsa, OK</w:t>
+        <w:t>Aeon  —  bespoke AI products for industrial businesses  |  Tulsa, OK</w:t>
       </w:r>
     </w:p>
     <w:p>
@@ -124,7 +124,7 @@
           <w:i w:val="0"/>
           <w:sz w:val="21"/>
         </w:rPr>
-        <w:t>Founded an AI consulting practice that embeds with companies to map how work actually happens, surface the highest-ROI automation opportunities, and build and ship enterprise-grade AI automations into their operations.</w:t>
+        <w:t>Co-founded Aeon (with a computer-science-PhD engineer) building bespoke AI products that kill real operational bottlenecks for mid-market energy (oil &amp; gas) and manufacturing companies. I own the engagement and the client relationship; my cofounder ships the build — the same strategist-plus-forward-deployed-engineer model this role runs on.</w:t>
       </w:r>
     </w:p>
     <w:p>
@@ -140,7 +140,7 @@
           <w:i w:val="0"/>
           <w:sz w:val="21"/>
         </w:rPr>
-        <w:t>Run engagements end to end — executive discovery and workflow mapping, through hands-on build, through rollout and adoption — using the modern agentic AI stack (Claude, multi-agent systems, and workflow-automation tooling).</w:t>
+        <w:t>Own every engagement from the first executive conversation: run a paid discovery workshop with the client's team — COO to field engineers — to surface where time and money actually leak, then scope it into a SOW and build proposal.</w:t>
       </w:r>
     </w:p>
     <w:p>
@@ -156,7 +156,39 @@
           <w:i w:val="0"/>
           <w:sz w:val="21"/>
         </w:rPr>
-        <w:t>Translate fuzzy executive asks into concrete technical direction, and engineering detail back into plain 'here's what it means for you' language for the client.</w:t>
+        <w:t>For a regionally top-tier upstream oil &amp; gas operator (nine-figure budget), discovery surfaced daily drilling reports as the bottleneck: contractor reports arriving in every format, hours a day lost standardizing them and building charts, with the drilling budget about to double. We shipped a system that ingests every report format and auto-generates their exact morning reporting (BHA analysis, depth-vs-days curves, field callouts), plus a tool that designs a strategy for a new well from historical offset-well data and explains the why behind it — compressing a weeks-long analysis into minutes.</w:t>
+      </w:r>
+    </w:p>
+    <w:p>
+      <w:pPr>
+        <w:pStyle w:val="ListBullet"/>
+        <w:spacing w:before="0" w:after="40" w:line="240" w:lineRule="auto"/>
+        <w:ind w:left="360"/>
+      </w:pPr>
+      <w:r>
+        <w:rPr>
+          <w:rFonts w:ascii="Calibri" w:hAnsi="Calibri"/>
+          <w:b w:val="0"/>
+          <w:i w:val="0"/>
+          <w:sz w:val="21"/>
+        </w:rPr>
+        <w:t>Stayed embedded the whole way — checkpoints, feedback sessions, MVPs in front of the team early and often — then trained them on the tool and rolled into an ongoing support-and-iteration contract. Drove adoption past launch, not just a demo.</w:t>
+      </w:r>
+    </w:p>
+    <w:p>
+      <w:pPr>
+        <w:pStyle w:val="ListBullet"/>
+        <w:spacing w:before="0" w:after="40" w:line="240" w:lineRule="auto"/>
+        <w:ind w:left="360"/>
+      </w:pPr>
+      <w:r>
+        <w:rPr>
+          <w:rFonts w:ascii="Calibri" w:hAnsi="Calibri"/>
+          <w:b w:val="0"/>
+          <w:i w:val="0"/>
+          <w:sz w:val="21"/>
+        </w:rPr>
+        <w:t>Daily practitioner on the modern agentic stack: Claude Code, Cowork, GitHub, Notion, Granola, Wispr Flow.</w:t>
       </w:r>
     </w:p>
     <w:p>
@@ -507,7 +539,7 @@
           <w:i w:val="0"/>
           <w:sz w:val="21"/>
         </w:rPr>
-        <w:t>Daily hands-on agentic AI stack (Claude, multi-agent systems, ChatGPT, workflow-automation tooling)</w:t>
+        <w:t>Daily hands-on agentic AI stack (Claude Code, Cowork, GitHub, multi-agent systems)</w:t>
       </w:r>
       <w:r>
         <w:rPr>

</xml_diff>